<commit_message>
feat(rollout): first-period timesheet due 10/2, updated invite letter + onboarding brief, approval-test routing
- First pay period (9/13-9/26) timesheets are due Friday 10/2 (one-time override in pay-periods.ts); SOPs note it.
- Invite email template: portal starts with the 9/13 period, balances as of 9/13, first-week checklist, 60-day
  run-alongside (sooner if no major issues), Carrileen as contact. (Repo copy only — not yet applied to Supabase.)
- Onboarding briefing rewritten: what's done, what's left, key dates, review-period plan.
- Accruals: balances rounded to cents. Test mode: approver alerts to johnnyrio22@gmail.com and test-account
  approvers included, for the Test User -> JRio leave-approval test.

Co-Authored-By: Claude Sonnet 5 <noreply@anthropic.com>
</commit_message>
<xml_diff>
--- a/onboarding/CHA_Onboarding_Briefing.docx
+++ b/onboarding/CHA_Onboarding_Briefing.docx
@@ -3,9 +3,13 @@
 <w:document xmlns:wpc="http://schemas.microsoft.com/office/word/2010/wordprocessingCanvas" xmlns:mo="http://schemas.microsoft.com/office/mac/office/2008/main" xmlns:mc="http://schemas.openxmlformats.org/markup-compatibility/2006" xmlns:mv="urn:schemas-microsoft-com:mac:vml" xmlns:o="urn:schemas-microsoft-com:office:office" xmlns:r="http://schemas.openxmlformats.org/officeDocument/2006/relationships" xmlns:m="http://schemas.openxmlformats.org/officeDocument/2006/math" xmlns:v="urn:schemas-microsoft-com:vml" xmlns:wp14="http://schemas.microsoft.com/office/word/2010/wordprocessingDrawing" xmlns:wp="http://schemas.openxmlformats.org/drawingml/2006/wordprocessingDrawing" xmlns:w10="urn:schemas-microsoft-com:office:word" xmlns:w="http://schemas.openxmlformats.org/wordprocessingml/2006/main" xmlns:w14="http://schemas.microsoft.com/office/word/2010/wordml" xmlns:wpg="http://schemas.microsoft.com/office/word/2010/wordprocessingGroup" xmlns:wpi="http://schemas.microsoft.com/office/word/2010/wordprocessingInk" xmlns:wne="http://schemas.microsoft.com/office/word/2006/wordml" xmlns:wps="http://schemas.microsoft.com/office/word/2010/wordprocessingShape" mc:Ignorable="w14 wp14">
   <w:body>
     <w:p>
+      <w:pPr>
+        <w:spacing w:after="40" w:before="0"/>
+      </w:pPr>
       <w:r>
         <w:rPr>
           <w:b/>
+          <w:i w:val="0"/>
           <w:color w:val="0B2B35"/>
           <w:sz w:val="40"/>
         </w:rPr>
@@ -13,29 +17,41 @@
       </w:r>
     </w:p>
     <w:p>
+      <w:pPr>
+        <w:spacing w:after="40" w:before="0"/>
+      </w:pPr>
       <w:r>
         <w:rPr>
-          <w:i/>
+          <w:b w:val="0"/>
+          <w:i w:val="0"/>
           <w:color w:val="595959"/>
           <w:sz w:val="24"/>
         </w:rPr>
-        <w:t>What we need from CHA to load real data and start the pilot</w:t>
+        <w:t>Where we are, and what is left before everyone is using it</w:t>
       </w:r>
     </w:p>
     <w:p>
+      <w:pPr>
+        <w:spacing w:after="160" w:before="0"/>
+      </w:pPr>
       <w:r>
         <w:rPr>
+          <w:b w:val="0"/>
+          <w:i w:val="0"/>
           <w:color w:val="595959"/>
           <w:sz w:val="18"/>
         </w:rPr>
-        <w:t>Prepared 2026-08-19</w:t>
+        <w:t>Updated 2026-09-26  ·  originally prepared 2026-08-19</w:t>
       </w:r>
     </w:p>
-    <w:p/>
     <w:p>
+      <w:pPr>
+        <w:spacing w:after="80" w:before="200"/>
+      </w:pPr>
       <w:r>
         <w:rPr>
           <w:b/>
+          <w:i w:val="0"/>
           <w:color w:val="02ACC0"/>
           <w:sz w:val="26"/>
         </w:rPr>
@@ -43,214 +59,643 @@
       </w:r>
     </w:p>
     <w:p>
+      <w:pPr>
+        <w:spacing w:after="120" w:before="0"/>
+      </w:pPr>
       <w:r>
         <w:rPr>
           <w:b w:val="0"/>
           <w:i w:val="0"/>
           <w:sz w:val="22"/>
         </w:rPr>
-        <w:t>The portal itself is built: every page (dashboard, leave requests, approvals, calendar, reports, timesheets) is now wired to real data instead of placeholder/demo data, real employee logins are in place, and an admin tool exists to load your roster and leave balances directly from spreadsheets. What’s left before we can start the pilot is CHA’s real data.</w:t>
+        <w:t>Most of the setup is done. Your roster and leave balances are loaded, the bi-weekly pay schedule is confirmed, and the portal covers timesheets, leave requests, approvals, expenses, and reports. Balances were loaded as of the end of September 12, so they reflect the start of the September 13 pay period — the first period the portal covers. PTO and sick accruals are switched on from that period.</w:t>
       </w:r>
     </w:p>
     <w:p>
-      <w:r>
-        <w:rPr>
-          <w:b/>
-          <w:color w:val="02ACC0"/>
-          <w:sz w:val="26"/>
-        </w:rPr>
-        <w:t>What We Need From CHA</w:t>
-      </w:r>
-    </w:p>
-    <w:p>
+      <w:pPr>
+        <w:spacing w:after="120" w:before="0"/>
+      </w:pPr>
       <w:r>
         <w:rPr>
           <w:b w:val="0"/>
           <w:i w:val="0"/>
           <w:sz w:val="22"/>
         </w:rPr>
-        <w:t>Two spreadsheets, already prepared and ready to fill out:</w:t>
+        <w:t>The portal now runs alongside our current process for roughly 60 days (about four pay cycles) to gather feedback. We may make it the official record sooner if no major issues come up.</w:t>
       </w:r>
     </w:p>
     <w:p>
       <w:pPr>
-        <w:pStyle w:val="ListBullet"/>
+        <w:spacing w:after="80" w:before="200"/>
       </w:pPr>
       <w:r>
         <w:rPr>
           <w:b/>
+          <w:i w:val="0"/>
+          <w:color w:val="02ACC0"/>
+          <w:sz w:val="26"/>
         </w:rPr>
-        <w:t xml:space="preserve">Employee Information Intake — </w:t>
-      </w:r>
-      <w:r>
-        <w:t>: full roster — name, work email (this becomes each employee’s portal login), employment type, role, department, job title, hire date, and mailing address.</w:t>
+        <w:t>Already Done</w:t>
       </w:r>
     </w:p>
     <w:p>
       <w:pPr>
-        <w:pStyle w:val="ListBullet"/>
+        <w:spacing w:after="60"/>
+        <w:ind w:left="120"/>
+      </w:pPr>
+      <w:r>
+        <w:rPr>
+          <w:b w:val="0"/>
+          <w:sz w:val="22"/>
+        </w:rPr>
+        <w:t xml:space="preserve">☑  </w:t>
+      </w:r>
+      <w:r>
+        <w:rPr>
+          <w:b/>
+          <w:sz w:val="22"/>
+        </w:rPr>
+        <w:t>Employee roster loaded</w:t>
+      </w:r>
+      <w:r>
+        <w:rPr>
+          <w:b w:val="0"/>
+          <w:sz w:val="22"/>
+        </w:rPr>
+        <w:t xml:space="preserve"> — names, work emails (each person’s login), roles, departments, hire dates.</w:t>
+      </w:r>
+    </w:p>
+    <w:p>
+      <w:pPr>
+        <w:spacing w:after="60"/>
+        <w:ind w:left="120"/>
+      </w:pPr>
+      <w:r>
+        <w:rPr>
+          <w:b w:val="0"/>
+          <w:sz w:val="22"/>
+        </w:rPr>
+        <w:t xml:space="preserve">☑  </w:t>
+      </w:r>
+      <w:r>
+        <w:rPr>
+          <w:b/>
+          <w:sz w:val="22"/>
+        </w:rPr>
+        <w:t>Leave balances loaded</w:t>
+      </w:r>
+      <w:r>
+        <w:rPr>
+          <w:b w:val="0"/>
+          <w:sz w:val="22"/>
+        </w:rPr>
+        <w:t xml:space="preserve"> — PTO, Sick, and Vacation as of the start of the 9/13 pay period; accruals are on from that period.</w:t>
+      </w:r>
+    </w:p>
+    <w:p>
+      <w:pPr>
+        <w:spacing w:after="60"/>
+        <w:ind w:left="120"/>
+      </w:pPr>
+      <w:r>
+        <w:rPr>
+          <w:b w:val="0"/>
+          <w:sz w:val="22"/>
+        </w:rPr>
+        <w:t xml:space="preserve">☑  </w:t>
+      </w:r>
+      <w:r>
+        <w:rPr>
+          <w:b/>
+          <w:sz w:val="22"/>
+        </w:rPr>
+        <w:t>Pay schedule confirmed</w:t>
+      </w:r>
+      <w:r>
+        <w:rPr>
+          <w:b w:val="0"/>
+          <w:sz w:val="22"/>
+        </w:rPr>
+        <w:t xml:space="preserve"> — Sunday–Saturday bi-weekly periods starting 9/13, paid by direct deposit on the Tuesday 17 days after each period ends (dates set through 2027).</w:t>
+      </w:r>
+    </w:p>
+    <w:p>
+      <w:pPr>
+        <w:spacing w:after="60"/>
+        <w:ind w:left="120"/>
+      </w:pPr>
+      <w:r>
+        <w:rPr>
+          <w:b w:val="0"/>
+          <w:sz w:val="22"/>
+        </w:rPr>
+        <w:t xml:space="preserve">☑  </w:t>
+      </w:r>
+      <w:r>
+        <w:rPr>
+          <w:b/>
+          <w:sz w:val="22"/>
+        </w:rPr>
+        <w:t>Roles and approvers set</w:t>
+      </w:r>
+      <w:r>
+        <w:rPr>
+          <w:b w:val="0"/>
+          <w:sz w:val="22"/>
+        </w:rPr>
+        <w:t xml:space="preserve"> — Nico Sanders (President/CEO) and Carrileen Edwards (Accounting Manager) approve; salary data is limited to them and the system administrator, and hidden until clicked.</w:t>
+      </w:r>
+    </w:p>
+    <w:p>
+      <w:pPr>
+        <w:spacing w:after="60"/>
+        <w:ind w:left="120"/>
+      </w:pPr>
+      <w:r>
+        <w:rPr>
+          <w:b w:val="0"/>
+          <w:sz w:val="22"/>
+        </w:rPr>
+        <w:t xml:space="preserve">☑  </w:t>
+      </w:r>
+      <w:r>
+        <w:rPr>
+          <w:b/>
+          <w:sz w:val="22"/>
+        </w:rPr>
+        <w:t>Leave rules built in</w:t>
+      </w:r>
+      <w:r>
+        <w:rPr>
+          <w:b w:val="0"/>
+          <w:sz w:val="22"/>
+        </w:rPr>
+        <w:t xml:space="preserve"> — sick leave is recorded automatically when the balance covers it; PTO, Vacation, Bereavement, and Jury Duty go to an approver; planned leave can be requested well ahead and is checked against projected balances.</w:t>
+      </w:r>
+    </w:p>
+    <w:p>
+      <w:pPr>
+        <w:spacing w:after="60"/>
+        <w:ind w:left="120"/>
+      </w:pPr>
+      <w:r>
+        <w:rPr>
+          <w:b w:val="0"/>
+          <w:sz w:val="22"/>
+        </w:rPr>
+        <w:t xml:space="preserve">☑  </w:t>
+      </w:r>
+      <w:r>
+        <w:rPr>
+          <w:b/>
+          <w:sz w:val="22"/>
+        </w:rPr>
+        <w:t>Timesheets ready</w:t>
+      </w:r>
+      <w:r>
+        <w:rPr>
+          <w:b w:val="0"/>
+          <w:sz w:val="22"/>
+        </w:rPr>
+        <w:t xml:space="preserve"> — regular and holiday hours fill in automatically, leave appears from approved requests, and there are approval, correction, and period-close controls for accounting.</w:t>
+      </w:r>
+    </w:p>
+    <w:p>
+      <w:pPr>
+        <w:spacing w:after="60"/>
+        <w:ind w:left="120"/>
+      </w:pPr>
+      <w:r>
+        <w:rPr>
+          <w:b w:val="0"/>
+          <w:sz w:val="22"/>
+        </w:rPr>
+        <w:t xml:space="preserve">☑  </w:t>
+      </w:r>
+      <w:r>
+        <w:rPr>
+          <w:b/>
+          <w:sz w:val="22"/>
+        </w:rPr>
+        <w:t>Reconciliation with Sage</w:t>
+      </w:r>
+      <w:r>
+        <w:rPr>
+          <w:b w:val="0"/>
+          <w:sz w:val="22"/>
+        </w:rPr>
+        <w:t xml:space="preserve"> — balances at each period close are saved, and a comparison tool checks them against Sage after payroll runs.</w:t>
+      </w:r>
+    </w:p>
+    <w:p>
+      <w:pPr>
+        <w:spacing w:after="60"/>
+        <w:ind w:left="120"/>
+      </w:pPr>
+      <w:r>
+        <w:rPr>
+          <w:b w:val="0"/>
+          <w:sz w:val="22"/>
+        </w:rPr>
+        <w:t xml:space="preserve">☑  </w:t>
+      </w:r>
+      <w:r>
+        <w:rPr>
+          <w:b/>
+          <w:sz w:val="22"/>
+        </w:rPr>
+        <w:t>Guides in the portal</w:t>
+      </w:r>
+      <w:r>
+        <w:rPr>
+          <w:b w:val="0"/>
+          <w:sz w:val="22"/>
+        </w:rPr>
+        <w:t xml:space="preserve"> — a How-To Guide for everyone and Staff and Admin &amp; Leadership SOPs.</w:t>
+      </w:r>
+    </w:p>
+    <w:p>
+      <w:pPr>
+        <w:spacing w:after="80" w:before="200"/>
       </w:pPr>
       <w:r>
         <w:rPr>
           <w:b/>
+          <w:i w:val="0"/>
+          <w:color w:val="02ACC0"/>
+          <w:sz w:val="26"/>
         </w:rPr>
-        <w:t xml:space="preserve">Leave Balance Validation — </w:t>
-      </w:r>
-      <w:r>
-        <w:t>: current PTO / sick / personal balances for each employee, plus CHA’s own accrual rates so we can double-check them against the portal’s calculations before anything goes live.</w:t>
+        <w:t>Still To Do</w:t>
       </w:r>
     </w:p>
     <w:p>
+      <w:pPr>
+        <w:spacing w:after="60"/>
+        <w:ind w:left="120"/>
+      </w:pPr>
+      <w:r>
+        <w:rPr>
+          <w:b w:val="0"/>
+          <w:sz w:val="22"/>
+        </w:rPr>
+        <w:t xml:space="preserve">☐  </w:t>
+      </w:r>
+      <w:r>
+        <w:rPr>
+          <w:b/>
+          <w:sz w:val="22"/>
+        </w:rPr>
+        <w:t>Send employee invitations</w:t>
+      </w:r>
+      <w:r>
+        <w:rPr>
+          <w:b w:val="0"/>
+          <w:sz w:val="22"/>
+        </w:rPr>
+        <w:t xml:space="preserve"> — the invitation now explains the 9/13 start and a first-week checklist. The first timesheet (9/13–9/26) is due Friday, October 2. Owner: Globalist Pro / CHA.</w:t>
+      </w:r>
+    </w:p>
+    <w:p>
+      <w:pPr>
+        <w:spacing w:after="60"/>
+        <w:ind w:left="120"/>
+      </w:pPr>
+      <w:r>
+        <w:rPr>
+          <w:b w:val="0"/>
+          <w:sz w:val="22"/>
+        </w:rPr>
+        <w:t xml:space="preserve">☐  </w:t>
+      </w:r>
+      <w:r>
+        <w:rPr>
+          <w:b/>
+          <w:sz w:val="22"/>
+        </w:rPr>
+        <w:t>Nico Sanders signs in</w:t>
+      </w:r>
+      <w:r>
+        <w:rPr>
+          <w:b w:val="0"/>
+          <w:sz w:val="22"/>
+        </w:rPr>
+        <w:t xml:space="preserve"> — he needs his own login to approve leave and expenses. Owner: Nico.</w:t>
+      </w:r>
+    </w:p>
+    <w:p>
+      <w:pPr>
+        <w:spacing w:after="60"/>
+        <w:ind w:left="120"/>
+      </w:pPr>
+      <w:r>
+        <w:rPr>
+          <w:b w:val="0"/>
+          <w:sz w:val="22"/>
+        </w:rPr>
+        <w:t xml:space="preserve">☐  </w:t>
+      </w:r>
+      <w:r>
+        <w:rPr>
+          <w:b/>
+          <w:sz w:val="22"/>
+        </w:rPr>
+        <w:t>Confirm the September 13 balances</w:t>
+      </w:r>
+      <w:r>
+        <w:rPr>
+          <w:b w:val="0"/>
+          <w:sz w:val="22"/>
+        </w:rPr>
+        <w:t xml:space="preserve"> — Carrileen is confirming (or updating) them by email. Any update is loaded as of 9/13 so accruals are not counted twice. Owner: Carrileen.</w:t>
+      </w:r>
+    </w:p>
+    <w:p>
+      <w:pPr>
+        <w:spacing w:after="60"/>
+        <w:ind w:left="120"/>
+      </w:pPr>
+      <w:r>
+        <w:rPr>
+          <w:b w:val="0"/>
+          <w:sz w:val="22"/>
+        </w:rPr>
+        <w:t xml:space="preserve">☐  </w:t>
+      </w:r>
+      <w:r>
+        <w:rPr>
+          <w:b/>
+          <w:sz w:val="22"/>
+        </w:rPr>
+        <w:t>Test the approval flow</w:t>
+      </w:r>
+      <w:r>
+        <w:rPr>
+          <w:b w:val="0"/>
+          <w:sz w:val="22"/>
+        </w:rPr>
+        <w:t xml:space="preserve"> — a test request from a test account, approved by an administrator, before staff use it. Owner: Globalist Pro.</w:t>
+      </w:r>
+    </w:p>
+    <w:p>
+      <w:pPr>
+        <w:spacing w:after="60"/>
+        <w:ind w:left="120"/>
+      </w:pPr>
+      <w:r>
+        <w:rPr>
+          <w:b w:val="0"/>
+          <w:sz w:val="22"/>
+        </w:rPr>
+        <w:t xml:space="preserve">☐  </w:t>
+      </w:r>
+      <w:r>
+        <w:rPr>
+          <w:b/>
+          <w:sz w:val="22"/>
+        </w:rPr>
+        <w:t>Confirm email delivery</w:t>
+      </w:r>
+      <w:r>
+        <w:rPr>
+          <w:b w:val="0"/>
+          <w:sz w:val="22"/>
+        </w:rPr>
+        <w:t xml:space="preserve"> — make sure approval and reminder emails reach staff from CHA’s domain. Owner: Globalist Pro.</w:t>
+      </w:r>
+    </w:p>
+    <w:p>
+      <w:pPr>
+        <w:spacing w:after="60"/>
+        <w:ind w:left="120"/>
+      </w:pPr>
+      <w:r>
+        <w:rPr>
+          <w:b w:val="0"/>
+          <w:sz w:val="22"/>
+        </w:rPr>
+        <w:t xml:space="preserve">☐  </w:t>
+      </w:r>
+      <w:r>
+        <w:rPr>
+          <w:b/>
+          <w:sz w:val="22"/>
+        </w:rPr>
+        <w:t>Decide the official date</w:t>
+      </w:r>
+      <w:r>
+        <w:rPr>
+          <w:b w:val="0"/>
+          <w:sz w:val="22"/>
+        </w:rPr>
+        <w:t xml:space="preserve"> — after the review period, or sooner. Owner: CHA leadership.</w:t>
+      </w:r>
+    </w:p>
+    <w:p>
+      <w:pPr>
+        <w:spacing w:after="60"/>
+        <w:ind w:left="120"/>
+      </w:pPr>
+      <w:r>
+        <w:rPr>
+          <w:b w:val="0"/>
+          <w:sz w:val="22"/>
+        </w:rPr>
+        <w:t xml:space="preserve">☐  </w:t>
+      </w:r>
+      <w:r>
+        <w:rPr>
+          <w:b/>
+          <w:sz w:val="22"/>
+        </w:rPr>
+        <w:t>Later: payroll tax fields</w:t>
+      </w:r>
+      <w:r>
+        <w:rPr>
+          <w:b w:val="0"/>
+          <w:sz w:val="22"/>
+        </w:rPr>
+        <w:t xml:space="preserve"> — so the portal’s calculations line up with Sage and there is less double entry.</w:t>
+      </w:r>
+    </w:p>
+    <w:p>
+      <w:pPr>
+        <w:spacing w:after="80" w:before="200"/>
+      </w:pPr>
+      <w:r>
+        <w:rPr>
+          <w:b/>
+          <w:i w:val="0"/>
+          <w:color w:val="02ACC0"/>
+          <w:sz w:val="26"/>
+        </w:rPr>
+        <w:t>Key Dates</w:t>
+      </w:r>
+    </w:p>
+    <w:p>
+      <w:pPr>
+        <w:spacing w:after="40" w:before="0"/>
+      </w:pPr>
       <w:r>
         <w:rPr>
           <w:b w:val="0"/>
           <w:i w:val="0"/>
           <w:sz w:val="22"/>
         </w:rPr>
-        <w:t>Both files have an Instructions tab and built-in dropdowns/validation to reduce errors. Please remove the example row before returning them.</w:t>
+        <w:t>9/13 – 9/26 (first period):  timesheets due Fri 10/2 (one-time extension)  ·  pay date 10/13</w:t>
       </w:r>
     </w:p>
     <w:p>
-      <w:r>
-        <w:rPr>
-          <w:b/>
-          <w:color w:val="02ACC0"/>
-          <w:sz w:val="26"/>
-        </w:rPr>
-        <w:t>A Few Other Things We Need Confirmed</w:t>
-      </w:r>
-    </w:p>
-    <w:p>
-      <w:r>
-        <w:rPr>
-          <w:sz w:val="24"/>
-        </w:rPr>
-        <w:t xml:space="preserve">☐  </w:t>
-      </w:r>
-      <w:r>
-        <w:rPr>
-          <w:sz w:val="22"/>
-        </w:rPr>
-        <w:t>Who at CHA will complete or coordinate these two spreadsheets (HR/Payroll contact)</w:t>
-      </w:r>
-    </w:p>
-    <w:p>
-      <w:r>
-        <w:rPr>
-          <w:sz w:val="24"/>
-        </w:rPr>
-        <w:t xml:space="preserve">☐  </w:t>
-      </w:r>
-      <w:r>
-        <w:rPr>
-          <w:sz w:val="22"/>
-        </w:rPr>
-        <w:t>Your actual bi-weekly pay period start date, so accrual calculations line up exactly with your cycle</w:t>
-      </w:r>
-    </w:p>
-    <w:p>
-      <w:r>
-        <w:rPr>
-          <w:sz w:val="24"/>
-        </w:rPr>
-        <w:t xml:space="preserve">☐  </w:t>
-      </w:r>
-      <w:r>
-        <w:rPr>
-          <w:sz w:val="22"/>
-        </w:rPr>
-        <w:t>Confirmation of who holds the CEO/approver role and any manager-level accounts, so portal permissions match reality</w:t>
-      </w:r>
-    </w:p>
-    <w:p>
-      <w:r>
-        <w:rPr>
-          <w:sz w:val="24"/>
-        </w:rPr>
-        <w:t xml:space="preserve">☐  </w:t>
-      </w:r>
-      <w:r>
-        <w:rPr>
-          <w:sz w:val="22"/>
-        </w:rPr>
-        <w:t>A target date to return the completed spreadsheets by</w:t>
-      </w:r>
-    </w:p>
-    <w:p>
-      <w:r>
-        <w:rPr>
-          <w:b/>
-          <w:color w:val="02ACC0"/>
-          <w:sz w:val="26"/>
-        </w:rPr>
-        <w:t>What Happens After You Send the Data Back</w:t>
-      </w:r>
-    </w:p>
-    <w:p>
+      <w:pPr>
+        <w:spacing w:after="40" w:before="0"/>
+      </w:pPr>
       <w:r>
         <w:rPr>
           <w:b w:val="0"/>
           <w:i w:val="0"/>
           <w:sz w:val="22"/>
         </w:rPr>
-        <w:t>1.  We validate everything before anything is loaded — duplicate emails, missing hire dates, rate mismatches, and any balance over the 400-hour PTO cap are all flagged for review first.</w:t>
+        <w:t>9/27 – 10/10:  timesheets due Mon 10/12  ·  pay date 10/27</w:t>
       </w:r>
     </w:p>
     <w:p>
+      <w:pPr>
+        <w:spacing w:after="40" w:before="0"/>
+      </w:pPr>
       <w:r>
         <w:rPr>
           <w:b w:val="0"/>
           <w:i w:val="0"/>
           <w:sz w:val="22"/>
         </w:rPr>
-        <w:t>2.  Any flagged issues are resolved with CHA before we seed the real database.</w:t>
+        <w:t>10/11 – 10/24:  timesheets due Mon 10/26  ·  pay date 11/10</w:t>
       </w:r>
     </w:p>
     <w:p>
+      <w:pPr>
+        <w:spacing w:after="40" w:before="0"/>
+      </w:pPr>
       <w:r>
         <w:rPr>
           <w:b w:val="0"/>
           <w:i w:val="0"/>
           <w:sz w:val="22"/>
         </w:rPr>
-        <w:t>3.  Employee and leave balance records are created in the portal.</w:t>
+        <w:t>10/25 – 11/7:  timesheets due Mon 11/9  ·  pay date 11/24</w:t>
       </w:r>
     </w:p>
     <w:p>
+      <w:pPr>
+        <w:spacing w:after="40" w:before="0"/>
+      </w:pPr>
       <w:r>
         <w:rPr>
           <w:b w:val="0"/>
           <w:i w:val="0"/>
           <w:sz w:val="22"/>
         </w:rPr>
-        <w:t>4.  Each employee receives their own portal invite by email to set up their login (replacing the shared demo login used during development).</w:t>
+        <w:t>Leave for the first period can be entered back to 9/13 through 10/8.</w:t>
       </w:r>
     </w:p>
     <w:p>
+      <w:pPr>
+        <w:spacing w:after="40" w:before="0"/>
+      </w:pPr>
       <w:r>
         <w:rPr>
           <w:b w:val="0"/>
           <w:i w:val="0"/>
           <w:sz w:val="22"/>
         </w:rPr>
-        <w:t>5.  A roughly 30-day parallel run begins: your team uses the portal alongside your existing system side by side. We do weekly check-ins comparing balances and timesheets between the two systems and fix anything that surfaces.</w:t>
+        <w:t>About 60 days from the 9/13 start (around mid-November): review and decide on the official date.</w:t>
       </w:r>
     </w:p>
     <w:p>
+      <w:pPr>
+        <w:spacing w:after="80" w:before="200"/>
+      </w:pPr>
+      <w:r>
+        <w:rPr>
+          <w:b/>
+          <w:i w:val="0"/>
+          <w:color w:val="02ACC0"/>
+          <w:sz w:val="26"/>
+        </w:rPr>
+        <w:t>How the Review Period Works</w:t>
+      </w:r>
+    </w:p>
+    <w:p>
+      <w:pPr>
+        <w:spacing w:after="60" w:before="0"/>
+      </w:pPr>
       <w:r>
         <w:rPr>
           <w:b w:val="0"/>
           <w:i w:val="0"/>
           <w:sz w:val="22"/>
         </w:rPr>
-        <w:t>6.  At the end of the pilot, we review together and make a go/no-go call on cutting over to the portal as the system of record.</w:t>
+        <w:t>1.  Staff record leave as it happens — in advance for planned time off — and submit their timesheet each pay period.</w:t>
       </w:r>
     </w:p>
-    <w:p/>
     <w:p>
+      <w:pPr>
+        <w:spacing w:after="60" w:before="0"/>
+      </w:pPr>
+      <w:r>
+        <w:rPr>
+          <w:b w:val="0"/>
+          <w:i w:val="0"/>
+          <w:sz w:val="22"/>
+        </w:rPr>
+        <w:t>2.  Approvers clear requests within a couple of days; the portal sends reminders for anything waiting longer.</w:t>
+      </w:r>
+    </w:p>
+    <w:p>
+      <w:pPr>
+        <w:spacing w:after="60" w:before="0"/>
+      </w:pPr>
+      <w:r>
+        <w:rPr>
+          <w:b w:val="0"/>
+          <w:i w:val="0"/>
+          <w:sz w:val="22"/>
+        </w:rPr>
+        <w:t>3.  Accounting approves the timesheets and closes the period, which saves every balance as of that date.</w:t>
+      </w:r>
+    </w:p>
+    <w:p>
+      <w:pPr>
+        <w:spacing w:after="60" w:before="0"/>
+      </w:pPr>
+      <w:r>
+        <w:rPr>
+          <w:b w:val="0"/>
+          <w:i w:val="0"/>
+          <w:sz w:val="22"/>
+        </w:rPr>
+        <w:t>4.  After payroll runs in Sage, balances are compared and any difference is investigated and, if needed, corrected with a recorded adjustment.</w:t>
+      </w:r>
+    </w:p>
+    <w:p>
+      <w:pPr>
+        <w:spacing w:after="60" w:before="0"/>
+      </w:pPr>
+      <w:r>
+        <w:rPr>
+          <w:b w:val="0"/>
+          <w:i w:val="0"/>
+          <w:sz w:val="22"/>
+        </w:rPr>
+        <w:t>5.  We check in weekly, fix anything that surfaces, and use what we learn before making the portal official.</w:t>
+      </w:r>
+    </w:p>
+    <w:p>
+      <w:pPr>
+        <w:spacing w:after="80" w:before="200"/>
+      </w:pPr>
       <w:r>
         <w:rPr>
           <w:b/>
+          <w:i w:val="0"/>
           <w:color w:val="02ACC0"/>
           <w:sz w:val="26"/>
         </w:rPr>
@@ -258,13 +703,16 @@
       </w:r>
     </w:p>
     <w:p>
+      <w:pPr>
+        <w:spacing w:after="120" w:before="0"/>
+      </w:pPr>
       <w:r>
         <w:rPr>
           <w:b w:val="0"/>
           <w:i w:val="0"/>
           <w:sz w:val="22"/>
         </w:rPr>
-        <w:t>The portal is ready on our end. The pilot start date is now driven by how quickly we can get the two completed spreadsheets back from CHA.</w:t>
+        <w:t>The portal is ready for staff. What remains is sending the invitations, getting Nico signed in, confirming the balances, and testing the approval flow — then the 60-day review begins in earnest, with the goal of a self-service timesheet and leave system that stays close to real-time.</w:t>
       </w:r>
     </w:p>
     <w:sectPr>

</xml_diff>